<commit_message>
Rearrange Regions: limits, Starting Location, Width, sort order, map
Fred's Limits section and Spacing note, plus the new options: Starting
Location, Width, Start with Welcome at bottom left, Sort by Name / Size,
Descending, and what happens to the map pictures. The .htm export is now
stale.

Co-Authored-By: Claude Opus 5.5 <noreply@anthropic.com>
</commit_message>
<xml_diff>
--- a/Rearrange.docx
+++ b/Rearrange.docx
@@ -1,6 +1,6 @@
 
 <file path=word/document.xml><?xml version="1.0" encoding="utf-8"?>
-<w:document xmlns:wpc="http://schemas.microsoft.com/office/word/2010/wordprocessingCanvas" xmlns:cx="http://schemas.microsoft.com/office/drawing/2014/chartex" xmlns:cx1="http://schemas.microsoft.com/office/drawing/2015/9/8/chartex" xmlns:cx2="http://schemas.microsoft.com/office/drawing/2015/10/21/chartex" xmlns:cx3="http://schemas.microsoft.com/office/drawing/2016/5/9/chartex" xmlns:cx4="http://schemas.microsoft.com/office/drawing/2016/5/10/chartex" xmlns:cx5="http://schemas.microsoft.com/office/drawing/2016/5/11/chartex" xmlns:cx6="http://schemas.microsoft.com/office/drawing/2016/5/12/chartex" xmlns:cx7="http://schemas.microsoft.com/office/drawing/2016/5/13/chartex" xmlns:cx8="http://schemas.microsoft.com/office/drawing/2016/5/14/chartex" xmlns:mc="http://schemas.openxmlformats.org/markup-compatibility/2006" xmlns:aink="http://schemas.microsoft.com/office/drawing/2016/ink" xmlns:am3d="http://schemas.microsoft.com/office/drawing/2017/model3d" xmlns:o="urn:schemas-microsoft-com:office:office" xmlns:oel="http://schemas.microsoft.com/office/2019/extlst" xmlns:r="http://schemas.openxmlformats.org/officeDocument/2006/relationships" xmlns:m="http://schemas.openxmlformats.org/officeDocument/2006/math" xmlns:v="urn:schemas-microsoft-com:vml" xmlns:wp14="http://schemas.microsoft.com/office/word/2010/wordprocessingDrawing" xmlns:wp="http://schemas.openxmlformats.org/drawingml/2006/wordprocessingDrawing" xmlns:w10="urn:schemas-microsoft-com:office:word" xmlns:w="http://schemas.openxmlformats.org/wordprocessingml/2006/main" xmlns:w14="http://schemas.microsoft.com/office/word/2010/wordml" xmlns:w15="http://schemas.microsoft.com/office/word/2012/wordml" xmlns:w16cex="http://schemas.microsoft.com/office/word/2018/wordml/cex" xmlns:w16cid="http://schemas.microsoft.com/office/word/2016/wordml/cid" xmlns:w16="http://schemas.microsoft.com/office/word/2018/wordml" xmlns:w16du="http://schemas.microsoft.com/office/word/2023/wordml/word16du" xmlns:w16sdtdh="http://schemas.microsoft.com/office/word/2020/wordml/sdtdatahash" xmlns:w16se="http://schemas.microsoft.com/office/word/2015/wordml/symex" xmlns:wpg="http://schemas.microsoft.com/office/word/2010/wordprocessingGroup" xmlns:wpi="http://schemas.microsoft.com/office/word/2010/wordprocessingInk" xmlns:wne="http://schemas.microsoft.com/office/word/2006/wordml" xmlns:wps="http://schemas.microsoft.com/office/word/2010/wordprocessingShape" mc:Ignorable="w14 w15 w16se w16cid w16 w16cex w16sdtdh w16du wp14">
+<w:document xmlns:wpc="http://schemas.microsoft.com/office/word/2010/wordprocessingCanvas" xmlns:cx="http://schemas.microsoft.com/office/drawing/2014/chartex" xmlns:cx1="http://schemas.microsoft.com/office/drawing/2015/9/8/chartex" xmlns:cx2="http://schemas.microsoft.com/office/drawing/2015/10/21/chartex" xmlns:cx3="http://schemas.microsoft.com/office/drawing/2016/5/9/chartex" xmlns:cx4="http://schemas.microsoft.com/office/drawing/2016/5/10/chartex" xmlns:cx5="http://schemas.microsoft.com/office/drawing/2016/5/11/chartex" xmlns:cx6="http://schemas.microsoft.com/office/drawing/2016/5/12/chartex" xmlns:cx7="http://schemas.microsoft.com/office/drawing/2016/5/13/chartex" xmlns:cx8="http://schemas.microsoft.com/office/drawing/2016/5/14/chartex" xmlns:mc="http://schemas.openxmlformats.org/markup-compatibility/2006" xmlns:aink="http://schemas.microsoft.com/office/drawing/2016/ink" xmlns:am3d="http://schemas.microsoft.com/office/drawing/2017/model3d" xmlns:o="urn:schemas-microsoft-com:office:office" xmlns:oel="http://schemas.microsoft.com/office/2019/extlst" xmlns:r="http://schemas.openxmlformats.org/officeDocument/2006/relationships" xmlns:m="http://schemas.openxmlformats.org/officeDocument/2006/math" xmlns:v="urn:schemas-microsoft-com:vml" xmlns:wp14="http://schemas.microsoft.com/office/word/2010/wordprocessingDrawing" xmlns:wp="http://schemas.openxmlformats.org/drawingml/2006/wordprocessingDrawing" xmlns:w10="urn:schemas-microsoft-com:office:word" xmlns:w="http://schemas.openxmlformats.org/wordprocessingml/2006/main" xmlns:w14="http://schemas.microsoft.com/office/word/2010/wordml" xmlns:w15="http://schemas.microsoft.com/office/word/2012/wordml" xmlns:w16cex="http://schemas.microsoft.com/office/word/2018/wordml/cex" xmlns:w16cid="http://schemas.microsoft.com/office/word/2016/wordml/cid" xmlns:w16="http://schemas.microsoft.com/office/word/2018/wordml" xmlns:w16du="http://schemas.microsoft.com/office/word/2023/wordml/word16du" xmlns:w16sdtdh="http://schemas.microsoft.com/office/word/2020/wordml/sdtdatahash" xmlns:w16sdtfl="http://schemas.microsoft.com/office/word/2024/wordml/sdtformatlock" xmlns:w16se="http://schemas.microsoft.com/office/word/2015/wordml/symex" xmlns:wpg="http://schemas.microsoft.com/office/word/2010/wordprocessingGroup" xmlns:wpi="http://schemas.microsoft.com/office/word/2010/wordprocessingInk" xmlns:wne="http://schemas.microsoft.com/office/word/2006/wordml" xmlns:wps="http://schemas.microsoft.com/office/word/2010/wordprocessingShape" mc:Ignorable="w14 w15 w16se w16cid w16 w16cex w16sdtdh w16sdtfl w16du wp14">
   <w:body>
     <w:p>
       <w:pPr>
@@ -52,14 +52,13 @@
       <w:r>
         <w:rPr>
           <w:rFonts w:ascii="Times New Roman" w:hAnsi="Times New Roman"/>
-          <w:noProof/>
           <w:lang w:val="en"/>
         </w:rPr>
         <w:drawing>
-          <wp:inline distT="0" distB="0" distL="0" distR="0" wp14:anchorId="6F812DD5" wp14:editId="49C82BC8">
-            <wp:extent cx="3305636" cy="3143689"/>
+          <wp:inline distT="0" distB="0" distL="0" distR="0" wp14:anchorId="28B0E48B" wp14:editId="253C7F31">
+            <wp:extent cx="4877481" cy="2495898"/>
             <wp:effectExtent l="0" t="0" r="0" b="0"/>
-            <wp:docPr id="420777048" name="Picture 1" descr="A screenshot of a computer&#10;&#10;Description automatically generated"/>
+            <wp:docPr id="1037506976" name="Picture 1"/>
             <wp:cNvGraphicFramePr>
               <a:graphicFrameLocks xmlns:a="http://schemas.openxmlformats.org/drawingml/2006/main" noChangeAspect="1"/>
             </wp:cNvGraphicFramePr>
@@ -67,11 +66,11 @@
               <a:graphicData uri="http://schemas.openxmlformats.org/drawingml/2006/picture">
                 <pic:pic xmlns:pic="http://schemas.openxmlformats.org/drawingml/2006/picture">
                   <pic:nvPicPr>
-                    <pic:cNvPr id="420777048" name="Picture 1" descr="A screenshot of a computer&#10;&#10;Description automatically generated"/>
+                    <pic:cNvPr id="1037506976" name=""/>
                     <pic:cNvPicPr/>
                   </pic:nvPicPr>
                   <pic:blipFill>
-                    <a:blip r:embed="rId4"/>
+                    <a:blip r:embed="rId5"/>
                     <a:stretch>
                       <a:fillRect/>
                     </a:stretch>
@@ -79,7 +78,7 @@
                   <pic:spPr>
                     <a:xfrm>
                       <a:off x="0" y="0"/>
-                      <a:ext cx="3305636" cy="3143689"/>
+                      <a:ext cx="4877481" cy="2495898"/>
                     </a:xfrm>
                     <a:prstGeom prst="rect">
                       <a:avLst/>
@@ -105,6 +104,22 @@
           <w:rFonts w:ascii="Times New Roman" w:hAnsi="Times New Roman"/>
           <w:lang w:val="en"/>
         </w:rPr>
+        <w:t>0 Spacing allows regions to touch. You can by default see 512 meters, so bigger numbers can cause the viewer to load distant regions, which slows frame rate.</w:t>
+      </w:r>
+    </w:p>
+    <w:p>
+      <w:pPr>
+        <w:ind w:left="720"/>
+        <w:rPr>
+          <w:rFonts w:ascii="Times New Roman" w:hAnsi="Times New Roman"/>
+          <w:lang w:val="en"/>
+        </w:rPr>
+      </w:pPr>
+      <w:r>
+        <w:rPr>
+          <w:rFonts w:ascii="Times New Roman" w:hAnsi="Times New Roman"/>
+          <w:lang w:val="en"/>
+        </w:rPr>
         <w:t xml:space="preserve">Packing </w:t>
       </w:r>
       <w:r>
@@ -119,14 +134,21 @@
           <w:rFonts w:ascii="Times New Roman" w:hAnsi="Times New Roman"/>
           <w:lang w:val="en"/>
         </w:rPr>
-        <w:t>only occurs if a region is enabled.</w:t>
-      </w:r>
-      <w:r>
-        <w:rPr>
-          <w:rFonts w:ascii="Times New Roman" w:hAnsi="Times New Roman"/>
-          <w:lang w:val="en"/>
-        </w:rPr>
-        <w:t xml:space="preserve"> You should disable any regions you do not want moved.</w:t>
+        <w:t>only occurs if a region is enabled</w:t>
+      </w:r>
+      <w:r>
+        <w:rPr>
+          <w:rFonts w:ascii="Times New Roman" w:hAnsi="Times New Roman"/>
+          <w:lang w:val="en"/>
+        </w:rPr>
+        <w:t xml:space="preserve"> and not locked.  </w:t>
+      </w:r>
+      <w:r>
+        <w:rPr>
+          <w:rFonts w:ascii="Times New Roman" w:hAnsi="Times New Roman"/>
+          <w:lang w:val="en"/>
+        </w:rPr>
+        <w:t>You should disable any regions you do not want moved.</w:t>
       </w:r>
       <w:r>
         <w:rPr>
@@ -135,6 +157,756 @@
         </w:rPr>
         <w:t xml:space="preserve"> </w:t>
       </w:r>
+    </w:p>
+    <w:p>
+      <w:pPr>
+        <w:pStyle w:val="Heading2"/>
+        <w:rPr>
+          <w:rFonts w:ascii="Times New Roman" w:hAnsi="Times New Roman"/>
+          <w:lang w:val="en"/>
+        </w:rPr>
+      </w:pPr>
+      <w:r>
+        <w:rPr>
+          <w:rFonts w:ascii="Times New Roman" w:hAnsi="Times New Roman"/>
+          <w:lang w:val="en"/>
+        </w:rPr>
+        <w:t xml:space="preserve">Starting Location</w:t>
+      </w:r>
+    </w:p>
+    <w:p>
+      <w:pPr>
+        <w:rPr>
+          <w:rFonts w:ascii="Times New Roman" w:hAnsi="Times New Roman"/>
+          <w:lang w:val="en"/>
+        </w:rPr>
+      </w:pPr>
+      <w:r>
+        <w:rPr>
+          <w:rFonts w:ascii="Times New Roman" w:hAnsi="Times New Roman"/>
+          <w:lang w:val="en"/>
+        </w:rPr>
+        <w:t xml:space="preserve">X and Y is the lower-left corner of the block. The next time you open this screen, X and Y show the corner of the last block you made.</w:t>
+      </w:r>
+    </w:p>
+    <w:p>
+      <w:pPr>
+        <w:pStyle w:val="Heading2"/>
+        <w:rPr>
+          <w:rFonts w:ascii="Times New Roman" w:hAnsi="Times New Roman"/>
+          <w:lang w:val="en"/>
+        </w:rPr>
+      </w:pPr>
+      <w:r>
+        <w:rPr>
+          <w:rFonts w:ascii="Times New Roman" w:hAnsi="Times New Roman"/>
+          <w:lang w:val="en"/>
+        </w:rPr>
+        <w:t xml:space="preserve">Width</w:t>
+      </w:r>
+    </w:p>
+    <w:p>
+      <w:pPr>
+        <w:rPr>
+          <w:rFonts w:ascii="Times New Roman" w:hAnsi="Times New Roman"/>
+          <w:lang w:val="en"/>
+        </w:rPr>
+      </w:pPr>
+      <w:r>
+        <w:rPr>
+          <w:rFonts w:ascii="Times New Roman" w:hAnsi="Times New Roman"/>
+          <w:lang w:val="en"/>
+        </w:rPr>
+        <w:t xml:space="preserve">Width is how many 256 x 256 squares fit across one row. A larger region uses more than one square. When a row is full, the next region starts a new row above it.</w:t>
+      </w:r>
+    </w:p>
+    <w:p>
+      <w:pPr>
+        <w:pStyle w:val="Heading2"/>
+        <w:rPr>
+          <w:rFonts w:ascii="Times New Roman" w:hAnsi="Times New Roman"/>
+          <w:lang w:val="en"/>
+        </w:rPr>
+      </w:pPr>
+      <w:r>
+        <w:rPr>
+          <w:rFonts w:ascii="Times New Roman" w:hAnsi="Times New Roman"/>
+          <w:lang w:val="en"/>
+        </w:rPr>
+        <w:t xml:space="preserve">Which order</w:t>
+      </w:r>
+    </w:p>
+    <w:p>
+      <w:pPr>
+        <w:rPr>
+          <w:rFonts w:ascii="Times New Roman" w:hAnsi="Times New Roman"/>
+          <w:lang w:val="en"/>
+        </w:rPr>
+      </w:pPr>
+      <w:r>
+        <w:rPr>
+          <w:rFonts w:ascii="Times New Roman" w:hAnsi="Times New Roman"/>
+          <w:lang w:val="en"/>
+        </w:rPr>
+        <w:t xml:space="preserve">- </w:t>
+      </w:r>
+      <w:r>
+        <w:rPr>
+          <w:rFonts w:ascii="Times New Roman" w:hAnsi="Times New Roman"/>
+          <w:b/>
+          <w:lang w:val="en"/>
+        </w:rPr>
+        <w:t xml:space="preserve">Start with Welcome at bottom left</w:t>
+      </w:r>
+      <w:r>
+        <w:rPr>
+          <w:rFonts w:ascii="Times New Roman" w:hAnsi="Times New Roman"/>
+          <w:lang w:val="en"/>
+        </w:rPr>
+        <w:t xml:space="preserve">: when ticked, your Welcome region goes first, in the lower-left corner. When not ticked, Welcome is sorted with the other regions.</w:t>
+      </w:r>
+    </w:p>
+    <w:p>
+      <w:pPr>
+        <w:rPr>
+          <w:rFonts w:ascii="Times New Roman" w:hAnsi="Times New Roman"/>
+          <w:lang w:val="en"/>
+        </w:rPr>
+      </w:pPr>
+      <w:r>
+        <w:rPr>
+          <w:rFonts w:ascii="Times New Roman" w:hAnsi="Times New Roman"/>
+          <w:lang w:val="en"/>
+        </w:rPr>
+        <w:t xml:space="preserve">- </w:t>
+      </w:r>
+      <w:r>
+        <w:rPr>
+          <w:rFonts w:ascii="Times New Roman" w:hAnsi="Times New Roman"/>
+          <w:b/>
+          <w:lang w:val="en"/>
+        </w:rPr>
+        <w:t xml:space="preserve">Sort by Name</w:t>
+      </w:r>
+      <w:r>
+        <w:rPr>
+          <w:rFonts w:ascii="Times New Roman" w:hAnsi="Times New Roman"/>
+          <w:lang w:val="en"/>
+        </w:rPr>
+        <w:t xml:space="preserve">: regions go in name order. Capital letters do not matter.</w:t>
+      </w:r>
+    </w:p>
+    <w:p>
+      <w:pPr>
+        <w:rPr>
+          <w:rFonts w:ascii="Times New Roman" w:hAnsi="Times New Roman"/>
+          <w:lang w:val="en"/>
+        </w:rPr>
+      </w:pPr>
+      <w:r>
+        <w:rPr>
+          <w:rFonts w:ascii="Times New Roman" w:hAnsi="Times New Roman"/>
+          <w:lang w:val="en"/>
+        </w:rPr>
+        <w:t xml:space="preserve">- </w:t>
+      </w:r>
+      <w:r>
+        <w:rPr>
+          <w:rFonts w:ascii="Times New Roman" w:hAnsi="Times New Roman"/>
+          <w:b/>
+          <w:lang w:val="en"/>
+        </w:rPr>
+        <w:t xml:space="preserve">Sort by Size</w:t>
+      </w:r>
+      <w:r>
+        <w:rPr>
+          <w:rFonts w:ascii="Times New Roman" w:hAnsi="Times New Roman"/>
+          <w:lang w:val="en"/>
+        </w:rPr>
+        <w:t xml:space="preserve">: small regions go first. Regions of the same size go in name order.</w:t>
+      </w:r>
+    </w:p>
+    <w:p>
+      <w:pPr>
+        <w:rPr>
+          <w:rFonts w:ascii="Times New Roman" w:hAnsi="Times New Roman"/>
+          <w:lang w:val="en"/>
+        </w:rPr>
+      </w:pPr>
+      <w:r>
+        <w:rPr>
+          <w:rFonts w:ascii="Times New Roman" w:hAnsi="Times New Roman"/>
+          <w:lang w:val="en"/>
+        </w:rPr>
+        <w:t xml:space="preserve">- </w:t>
+      </w:r>
+      <w:r>
+        <w:rPr>
+          <w:rFonts w:ascii="Times New Roman" w:hAnsi="Times New Roman"/>
+          <w:b/>
+          <w:lang w:val="en"/>
+        </w:rPr>
+        <w:t xml:space="preserve">Descending</w:t>
+      </w:r>
+      <w:r>
+        <w:rPr>
+          <w:rFonts w:ascii="Times New Roman" w:hAnsi="Times New Roman"/>
+          <w:lang w:val="en"/>
+        </w:rPr>
+        <w:t xml:space="preserve">: turns the order around, Z to A, or large to small.</w:t>
+      </w:r>
+    </w:p>
+    <w:p>
+      <w:pPr>
+        <w:rPr>
+          <w:rFonts w:ascii="Times New Roman" w:hAnsi="Times New Roman"/>
+          <w:lang w:val="en"/>
+        </w:rPr>
+      </w:pPr>
+      <w:r>
+        <w:rPr>
+          <w:rFonts w:ascii="Times New Roman" w:hAnsi="Times New Roman"/>
+          <w:lang w:val="en"/>
+        </w:rPr>
+        <w:t xml:space="preserve">DreamGrid remembers these choices for next time. When Start with Welcome at bottom left is ticked, the Welcome region moves even if it is disabled.</w:t>
+      </w:r>
+    </w:p>
+    <w:p>
+      <w:pPr>
+        <w:pStyle w:val="Heading2"/>
+        <w:rPr>
+          <w:rFonts w:ascii="Times New Roman" w:hAnsi="Times New Roman"/>
+          <w:lang w:val="en"/>
+        </w:rPr>
+      </w:pPr>
+      <w:r>
+        <w:rPr>
+          <w:rFonts w:ascii="Times New Roman" w:hAnsi="Times New Roman"/>
+          <w:lang w:val="en"/>
+        </w:rPr>
+        <w:t xml:space="preserve">The map</w:t>
+      </w:r>
+    </w:p>
+    <w:p>
+      <w:pPr>
+        <w:rPr>
+          <w:rFonts w:ascii="Times New Roman" w:hAnsi="Times New Roman"/>
+          <w:lang w:val="en"/>
+        </w:rPr>
+      </w:pPr>
+      <w:r>
+        <w:rPr>
+          <w:rFonts w:ascii="Times New Roman" w:hAnsi="Times New Roman"/>
+          <w:lang w:val="en"/>
+        </w:rPr>
+        <w:t xml:space="preserve">Each region’s own map picture moves with it. The zoomed-out map pictures are deleted, and OpenSimulator draws them again the next time the regions start.</w:t>
+      </w:r>
+    </w:p>
+    <w:p>
+      <w:pPr>
+        <w:pStyle w:val="Heading2"/>
+        <w:rPr>
+          <w:lang w:val="en"/>
+        </w:rPr>
+      </w:pPr>
+      <w:r>
+        <w:rPr>
+          <w:lang w:val="en"/>
+        </w:rPr>
+        <w:t>Limits:</w:t>
+      </w:r>
+    </w:p>
+    <w:p>
+      <w:pPr>
+        <w:ind w:firstLine="720"/>
+        <w:rPr>
+          <w:rFonts w:ascii="Times New Roman" w:hAnsi="Times New Roman"/>
+          <w:lang w:val="en"/>
+        </w:rPr>
+      </w:pPr>
+    </w:p>
+    <w:p>
+      <w:pPr>
+        <w:ind w:firstLine="720"/>
+        <w:rPr>
+          <w:rFonts w:ascii="Times New Roman" w:hAnsi="Times New Roman"/>
+          <w:lang w:val="en"/>
+        </w:rPr>
+      </w:pPr>
+      <w:r>
+        <w:rPr>
+          <w:rFonts w:ascii="Times New Roman" w:hAnsi="Times New Roman"/>
+          <w:lang w:val="en"/>
+        </w:rPr>
+        <w:t xml:space="preserve">I capped X and Y at less </w:t>
+      </w:r>
+      <w:r>
+        <w:rPr>
+          <w:rFonts w:ascii="Times New Roman" w:hAnsi="Times New Roman"/>
+          <w:lang w:val="en"/>
+        </w:rPr>
+        <w:t>than 16384.</w:t>
+      </w:r>
+      <w:r>
+        <w:rPr>
+          <w:rFonts w:ascii="Times New Roman" w:hAnsi="Times New Roman"/>
+          <w:lang w:val="en"/>
+        </w:rPr>
+        <w:t xml:space="preserve">  </w:t>
+      </w:r>
+      <w:r>
+        <w:rPr>
+          <w:rFonts w:ascii="Times New Roman" w:hAnsi="Times New Roman"/>
+          <w:lang w:val="en"/>
+        </w:rPr>
+        <w:t xml:space="preserve">Robust rejects Y ≤ 16 (reserved for Hypergrid links). </w:t>
+      </w:r>
+      <w:r>
+        <w:rPr>
+          <w:rFonts w:ascii="Times New Roman" w:hAnsi="Times New Roman"/>
+          <w:lang w:val="en"/>
+        </w:rPr>
+        <w:t>A region cannot move higher in Y than 16384.</w:t>
+      </w:r>
+    </w:p>
+    <w:p>
+      <w:pPr>
+        <w:ind w:left="720"/>
+        <w:rPr>
+          <w:rFonts w:ascii="Times New Roman" w:hAnsi="Times New Roman"/>
+          <w:lang w:val="en"/>
+        </w:rPr>
+      </w:pPr>
+      <w:r>
+        <w:rPr>
+          <w:rFonts w:ascii="Times New Roman" w:hAnsi="Times New Roman"/>
+          <w:lang w:val="en"/>
+        </w:rPr>
+        <w:t xml:space="preserve">There are map issues:  </w:t>
+      </w:r>
+      <w:r>
+        <w:rPr>
+          <w:rFonts w:ascii="Times New Roman" w:hAnsi="Times New Roman"/>
+          <w:lang w:val="en"/>
+        </w:rPr>
+        <w:t xml:space="preserve">Firestorm's world map doesn't ask for region info past </w:t>
+      </w:r>
+      <w:r>
+        <w:rPr>
+          <w:rFonts w:ascii="Times New Roman" w:hAnsi="Times New Roman"/>
+          <w:lang w:val="en"/>
+        </w:rPr>
+        <w:t>16,38</w:t>
+      </w:r>
+      <w:r>
+        <w:rPr>
+          <w:rFonts w:ascii="Times New Roman" w:hAnsi="Times New Roman"/>
+          <w:lang w:val="en"/>
+        </w:rPr>
+        <w:t>4</w:t>
+      </w:r>
+      <w:r>
+        <w:rPr>
+          <w:rFonts w:ascii="Times New Roman" w:hAnsi="Times New Roman"/>
+          <w:lang w:val="en"/>
+        </w:rPr>
+        <w:t>. Tile pictures still show, but there are no region</w:t>
+      </w:r>
+      <w:r>
+        <w:rPr>
+          <w:rFonts w:ascii="Times New Roman" w:hAnsi="Times New Roman"/>
+          <w:lang w:val="en"/>
+        </w:rPr>
+        <w:t xml:space="preserve"> </w:t>
+      </w:r>
+      <w:r>
+        <w:rPr>
+          <w:rFonts w:ascii="Times New Roman" w:hAnsi="Times New Roman"/>
+          <w:lang w:val="en"/>
+        </w:rPr>
+        <w:t>names, no hover text and no avatar dots. Clicking to teleport should still wor</w:t>
+      </w:r>
+      <w:r>
+        <w:rPr>
+          <w:rFonts w:ascii="Times New Roman" w:hAnsi="Times New Roman"/>
+          <w:lang w:val="en"/>
+        </w:rPr>
+        <w:t>k!</w:t>
+      </w:r>
+    </w:p>
+    <w:p>
+      <w:pPr>
+        <w:ind w:left="720"/>
+        <w:rPr>
+          <w:rFonts w:ascii="Times New Roman" w:hAnsi="Times New Roman"/>
+          <w:lang w:val="en"/>
+        </w:rPr>
+      </w:pPr>
+      <w:r>
+        <w:rPr>
+          <w:rFonts w:ascii="Times New Roman" w:hAnsi="Times New Roman"/>
+          <w:lang w:val="en"/>
+        </w:rPr>
+        <w:t xml:space="preserve">At 65,535, </w:t>
+      </w:r>
+      <w:r>
+        <w:rPr>
+          <w:rFonts w:ascii="Times New Roman" w:hAnsi="Times New Roman"/>
+          <w:lang w:val="en"/>
+        </w:rPr>
+        <w:t>Map messages store X/Y in 16 bits and wrap around.</w:t>
+      </w:r>
+    </w:p>
+    <w:p>
+      <w:pPr>
+        <w:ind w:left="720"/>
+        <w:rPr>
+          <w:rFonts w:ascii="Times New Roman" w:hAnsi="Times New Roman"/>
+          <w:lang w:val="en"/>
+        </w:rPr>
+      </w:pPr>
+      <w:r>
+        <w:rPr>
+          <w:rFonts w:ascii="Times New Roman" w:hAnsi="Times New Roman"/>
+          <w:lang w:val="en"/>
+        </w:rPr>
+        <w:t xml:space="preserve">At </w:t>
+      </w:r>
+      <w:r>
+        <w:rPr>
+          <w:rFonts w:ascii="Times New Roman" w:hAnsi="Times New Roman"/>
+          <w:lang w:val="en"/>
+        </w:rPr>
+        <w:t>8,388,607</w:t>
+      </w:r>
+      <w:r>
+        <w:rPr>
+          <w:rFonts w:ascii="Times New Roman" w:hAnsi="Times New Roman"/>
+          <w:lang w:val="en"/>
+        </w:rPr>
+        <w:t xml:space="preserve">, </w:t>
+      </w:r>
+      <w:r>
+        <w:rPr>
+          <w:rFonts w:ascii="Times New Roman" w:hAnsi="Times New Roman"/>
+          <w:lang w:val="en"/>
+        </w:rPr>
+        <w:t>Robust stores meters as a 32-bit integer and overflows.</w:t>
+      </w:r>
+    </w:p>
+    <w:p>
+      <w:pPr>
+        <w:ind w:firstLine="720"/>
+        <w:rPr>
+          <w:rFonts w:ascii="Times New Roman" w:hAnsi="Times New Roman"/>
+          <w:lang w:val="en"/>
+        </w:rPr>
+      </w:pPr>
+      <w:r>
+        <w:rPr>
+          <w:rFonts w:ascii="Times New Roman" w:hAnsi="Times New Roman"/>
+          <w:lang w:val="en"/>
+        </w:rPr>
+        <w:t>Because I can</w:t>
+      </w:r>
+      <w:r>
+        <w:rPr>
+          <w:rFonts w:ascii="Times New Roman" w:hAnsi="Times New Roman"/>
+          <w:lang w:val="en"/>
+        </w:rPr>
+        <w:t xml:space="preserve"> do this,</w:t>
+      </w:r>
+      <w:r>
+        <w:rPr>
+          <w:rFonts w:ascii="Times New Roman" w:hAnsi="Times New Roman"/>
+          <w:lang w:val="en"/>
+        </w:rPr>
+        <w:t xml:space="preserve"> I set the limit 16,384.  This is still </w:t>
+      </w:r>
+      <w:proofErr w:type="gramStart"/>
+      <w:r>
+        <w:rPr>
+          <w:rFonts w:ascii="Times New Roman" w:hAnsi="Times New Roman"/>
+          <w:lang w:val="en"/>
+        </w:rPr>
+        <w:t>pretty large</w:t>
+      </w:r>
+      <w:proofErr w:type="gramEnd"/>
+      <w:r>
+        <w:rPr>
+          <w:rFonts w:ascii="Times New Roman" w:hAnsi="Times New Roman"/>
+          <w:lang w:val="en"/>
+        </w:rPr>
+        <w:t xml:space="preserve"> and is also a limit </w:t>
+      </w:r>
+      <w:r>
+        <w:rPr>
+          <w:rFonts w:ascii="Times New Roman" w:hAnsi="Times New Roman"/>
+          <w:lang w:val="en"/>
+        </w:rPr>
+        <w:t>i</w:t>
+      </w:r>
+      <w:r>
+        <w:rPr>
+          <w:rFonts w:ascii="Times New Roman" w:hAnsi="Times New Roman"/>
+          <w:lang w:val="en"/>
+        </w:rPr>
+        <w:t xml:space="preserve">n your grid’s Endless Land, Sea, Roads, and Cities. </w:t>
+      </w:r>
+    </w:p>
+    <w:p>
+      <w:pPr>
+        <w:numPr>
+          <w:ilvl w:val="0"/>
+          <w:numId w:val="1"/>
+        </w:numPr>
+        <w:tabs>
+          <w:tab w:val="num" w:pos="720"/>
+        </w:tabs>
+        <w:rPr>
+          <w:rFonts w:ascii="Times New Roman" w:hAnsi="Times New Roman"/>
+        </w:rPr>
+      </w:pPr>
+      <w:r>
+        <w:rPr>
+          <w:rFonts w:ascii="Times New Roman" w:hAnsi="Times New Roman"/>
+          <w:b/>
+          <w:bCs/>
+        </w:rPr>
+        <w:t>The entire dwarf planet Pluto:</w:t>
+      </w:r>
+      <w:r>
+        <w:rPr>
+          <w:rFonts w:ascii="Times New Roman" w:hAnsi="Times New Roman"/>
+        </w:rPr>
+        <w:t xml:space="preserve"> The total surface area of Pluto is roughly </w:t>
+      </w:r>
+      <w:r>
+        <w:rPr>
+          <w:rFonts w:ascii="Times New Roman" w:hAnsi="Times New Roman"/>
+          <w:b/>
+          <w:bCs/>
+        </w:rPr>
+        <w:t>17.65 million km²</w:t>
+      </w:r>
+      <w:r>
+        <w:rPr>
+          <w:rFonts w:ascii="Times New Roman" w:hAnsi="Times New Roman"/>
+        </w:rPr>
+        <w:t>, making your defined square almost an exact match to the exterior of that celestial body.</w:t>
+      </w:r>
+    </w:p>
+    <w:p>
+      <w:pPr>
+        <w:numPr>
+          <w:ilvl w:val="0"/>
+          <w:numId w:val="1"/>
+        </w:numPr>
+        <w:tabs>
+          <w:tab w:val="num" w:pos="720"/>
+        </w:tabs>
+        <w:rPr>
+          <w:rFonts w:ascii="Times New Roman" w:hAnsi="Times New Roman"/>
+        </w:rPr>
+      </w:pPr>
+      <w:r>
+        <w:rPr>
+          <w:rFonts w:ascii="Times New Roman" w:hAnsi="Times New Roman"/>
+          <w:b/>
+          <w:bCs/>
+        </w:rPr>
+        <w:t>The country of Russia:</w:t>
+      </w:r>
+      <w:r>
+        <w:rPr>
+          <w:rFonts w:ascii="Times New Roman" w:hAnsi="Times New Roman"/>
+        </w:rPr>
+        <w:t xml:space="preserve"> </w:t>
+      </w:r>
+      <w:hyperlink r:id="rId6" w:tgtFrame="_blank" w:history="1">
+        <w:r>
+          <w:rPr>
+            <w:rStyle w:val="Hyperlink"/>
+            <w:rFonts w:ascii="Times New Roman" w:hAnsi="Times New Roman"/>
+          </w:rPr>
+          <w:t>Russia</w:t>
+        </w:r>
+      </w:hyperlink>
+      <w:r>
+        <w:rPr>
+          <w:rFonts w:ascii="Times New Roman" w:hAnsi="Times New Roman"/>
+        </w:rPr>
+        <w:t xml:space="preserve"> is the largest nation on Earth, covering </w:t>
+      </w:r>
+      <w:r>
+        <w:rPr>
+          <w:rFonts w:ascii="Times New Roman" w:hAnsi="Times New Roman"/>
+          <w:b/>
+          <w:bCs/>
+        </w:rPr>
+        <w:t>17.10 million km²</w:t>
+      </w:r>
+      <w:r>
+        <w:rPr>
+          <w:rFonts w:ascii="Times New Roman" w:hAnsi="Times New Roman"/>
+        </w:rPr>
+        <w:t xml:space="preserve">. </w:t>
+      </w:r>
+      <w:r>
+        <w:rPr>
+          <w:rFonts w:ascii="Times New Roman" w:hAnsi="Times New Roman"/>
+        </w:rPr>
+        <w:t>Our</w:t>
+      </w:r>
+      <w:r>
+        <w:rPr>
+          <w:rFonts w:ascii="Times New Roman" w:hAnsi="Times New Roman"/>
+        </w:rPr>
+        <w:t xml:space="preserve"> area </w:t>
+      </w:r>
+      <w:proofErr w:type="gramStart"/>
+      <w:r>
+        <w:rPr>
+          <w:rFonts w:ascii="Times New Roman" w:hAnsi="Times New Roman"/>
+        </w:rPr>
+        <w:t>is just</w:t>
+      </w:r>
+      <w:proofErr w:type="gramEnd"/>
+      <w:r>
+        <w:rPr>
+          <w:rFonts w:ascii="Times New Roman" w:hAnsi="Times New Roman"/>
+        </w:rPr>
+        <w:t xml:space="preserve"> slightly larger than the entire country.</w:t>
+      </w:r>
+    </w:p>
+    <w:p>
+      <w:pPr>
+        <w:numPr>
+          <w:ilvl w:val="0"/>
+          <w:numId w:val="1"/>
+        </w:numPr>
+        <w:tabs>
+          <w:tab w:val="num" w:pos="720"/>
+        </w:tabs>
+        <w:rPr>
+          <w:rFonts w:ascii="Times New Roman" w:hAnsi="Times New Roman"/>
+        </w:rPr>
+      </w:pPr>
+      <w:r>
+        <w:rPr>
+          <w:rFonts w:ascii="Times New Roman" w:hAnsi="Times New Roman"/>
+          <w:b/>
+          <w:bCs/>
+        </w:rPr>
+        <w:t>The continent of South America:</w:t>
+      </w:r>
+      <w:r>
+        <w:rPr>
+          <w:rFonts w:ascii="Times New Roman" w:hAnsi="Times New Roman"/>
+        </w:rPr>
+        <w:t xml:space="preserve"> The land area of South America spans about </w:t>
+      </w:r>
+      <w:r>
+        <w:rPr>
+          <w:rFonts w:ascii="Times New Roman" w:hAnsi="Times New Roman"/>
+          <w:b/>
+          <w:bCs/>
+        </w:rPr>
+        <w:t>17.84 million km²</w:t>
+      </w:r>
+      <w:r>
+        <w:rPr>
+          <w:rFonts w:ascii="Times New Roman" w:hAnsi="Times New Roman"/>
+        </w:rPr>
+        <w:t>, making your square nearly identical in total footprint.</w:t>
+      </w:r>
+    </w:p>
+    <w:p>
+      <w:pPr>
+        <w:numPr>
+          <w:ilvl w:val="0"/>
+          <w:numId w:val="1"/>
+        </w:numPr>
+        <w:tabs>
+          <w:tab w:val="num" w:pos="720"/>
+        </w:tabs>
+        <w:rPr>
+          <w:rFonts w:ascii="Times New Roman" w:hAnsi="Times New Roman"/>
+        </w:rPr>
+      </w:pPr>
+      <w:r>
+        <w:rPr>
+          <w:rFonts w:ascii="Times New Roman" w:hAnsi="Times New Roman"/>
+          <w:b/>
+          <w:bCs/>
+        </w:rPr>
+        <w:t>About half of the Moon:</w:t>
+      </w:r>
+      <w:r>
+        <w:rPr>
+          <w:rFonts w:ascii="Times New Roman" w:hAnsi="Times New Roman"/>
+        </w:rPr>
+        <w:t xml:space="preserve"> The total surface area of Earth's Moon is </w:t>
+      </w:r>
+      <w:r>
+        <w:rPr>
+          <w:rFonts w:ascii="Times New Roman" w:hAnsi="Times New Roman"/>
+          <w:b/>
+          <w:bCs/>
+        </w:rPr>
+        <w:t>37.94 million km²</w:t>
+      </w:r>
+      <w:r>
+        <w:rPr>
+          <w:rFonts w:ascii="Times New Roman" w:hAnsi="Times New Roman"/>
+        </w:rPr>
+        <w:t xml:space="preserve">. </w:t>
+      </w:r>
+      <w:r>
+        <w:rPr>
+          <w:rFonts w:ascii="Times New Roman" w:hAnsi="Times New Roman"/>
+        </w:rPr>
+        <w:t xml:space="preserve">Our world </w:t>
+      </w:r>
+      <w:r>
+        <w:rPr>
+          <w:rFonts w:ascii="Times New Roman" w:hAnsi="Times New Roman"/>
+        </w:rPr>
+        <w:t>square would cover about 46% of the Moon's entire surface</w:t>
+      </w:r>
+      <w:r>
+        <w:rPr>
+          <w:rFonts w:ascii="Times New Roman" w:hAnsi="Times New Roman"/>
+        </w:rPr>
+        <w:t>!</w:t>
+      </w:r>
+    </w:p>
+    <w:p>
+      <w:pPr>
+        <w:ind w:left="720"/>
+        <w:rPr>
+          <w:rFonts w:ascii="Times New Roman" w:hAnsi="Times New Roman"/>
+          <w:lang w:val="en"/>
+        </w:rPr>
+      </w:pPr>
+    </w:p>
+    <w:p>
+      <w:pPr>
+        <w:ind w:left="720"/>
+        <w:rPr>
+          <w:rFonts w:ascii="Times New Roman" w:hAnsi="Times New Roman"/>
+          <w:lang w:val="en"/>
+        </w:rPr>
+      </w:pPr>
+    </w:p>
+    <w:p>
+      <w:pPr>
+        <w:ind w:left="720"/>
+        <w:rPr>
+          <w:rFonts w:ascii="Times New Roman" w:hAnsi="Times New Roman"/>
+          <w:lang w:val="en"/>
+        </w:rPr>
+      </w:pPr>
     </w:p>
     <w:p>
       <w:pPr>
@@ -163,8 +935,165 @@
 </w:document>
 </file>
 
+<file path=word/numbering.xml><?xml version="1.0" encoding="utf-8"?>
+<w:numbering xmlns:wpc="http://schemas.microsoft.com/office/word/2010/wordprocessingCanvas" xmlns:cx="http://schemas.microsoft.com/office/drawing/2014/chartex" xmlns:cx1="http://schemas.microsoft.com/office/drawing/2015/9/8/chartex" xmlns:cx2="http://schemas.microsoft.com/office/drawing/2015/10/21/chartex" xmlns:cx3="http://schemas.microsoft.com/office/drawing/2016/5/9/chartex" xmlns:cx4="http://schemas.microsoft.com/office/drawing/2016/5/10/chartex" xmlns:cx5="http://schemas.microsoft.com/office/drawing/2016/5/11/chartex" xmlns:cx6="http://schemas.microsoft.com/office/drawing/2016/5/12/chartex" xmlns:cx7="http://schemas.microsoft.com/office/drawing/2016/5/13/chartex" xmlns:cx8="http://schemas.microsoft.com/office/drawing/2016/5/14/chartex" xmlns:mc="http://schemas.openxmlformats.org/markup-compatibility/2006" xmlns:aink="http://schemas.microsoft.com/office/drawing/2016/ink" xmlns:am3d="http://schemas.microsoft.com/office/drawing/2017/model3d" xmlns:o="urn:schemas-microsoft-com:office:office" xmlns:oel="http://schemas.microsoft.com/office/2019/extlst" xmlns:r="http://schemas.openxmlformats.org/officeDocument/2006/relationships" xmlns:m="http://schemas.openxmlformats.org/officeDocument/2006/math" xmlns:v="urn:schemas-microsoft-com:vml" xmlns:wp14="http://schemas.microsoft.com/office/word/2010/wordprocessingDrawing" xmlns:wp="http://schemas.openxmlformats.org/drawingml/2006/wordprocessingDrawing" xmlns:w10="urn:schemas-microsoft-com:office:word" xmlns:w="http://schemas.openxmlformats.org/wordprocessingml/2006/main" xmlns:w14="http://schemas.microsoft.com/office/word/2010/wordml" xmlns:w15="http://schemas.microsoft.com/office/word/2012/wordml" xmlns:w16cex="http://schemas.microsoft.com/office/word/2018/wordml/cex" xmlns:w16cid="http://schemas.microsoft.com/office/word/2016/wordml/cid" xmlns:w16="http://schemas.microsoft.com/office/word/2018/wordml" xmlns:w16du="http://schemas.microsoft.com/office/word/2023/wordml/word16du" xmlns:w16sdtdh="http://schemas.microsoft.com/office/word/2020/wordml/sdtdatahash" xmlns:w16sdtfl="http://schemas.microsoft.com/office/word/2024/wordml/sdtformatlock" xmlns:w16se="http://schemas.microsoft.com/office/word/2015/wordml/symex" xmlns:wpg="http://schemas.microsoft.com/office/word/2010/wordprocessingGroup" xmlns:wpi="http://schemas.microsoft.com/office/word/2010/wordprocessingInk" xmlns:wne="http://schemas.microsoft.com/office/word/2006/wordml" xmlns:wps="http://schemas.microsoft.com/office/word/2010/wordprocessingShape" mc:Ignorable="w14 w15 w16se w16cid w16 w16cex w16sdtdh w16sdtfl w16du wp14">
+  <w:abstractNum w:abstractNumId="0" w15:restartNumberingAfterBreak="0">
+    <w:nsid w:val="38140A7E"/>
+    <w:multiLevelType w:val="multilevel"/>
+    <w:tmpl w:val="4628DB20"/>
+    <w:lvl w:ilvl="0">
+      <w:start w:val="1"/>
+      <w:numFmt w:val="bullet"/>
+      <w:lvlText w:val=""/>
+      <w:lvlJc w:val="left"/>
+      <w:pPr>
+        <w:tabs>
+          <w:tab w:val="num" w:pos="1440"/>
+        </w:tabs>
+        <w:ind w:left="1440" w:hanging="360"/>
+      </w:pPr>
+      <w:rPr>
+        <w:rFonts w:ascii="Symbol" w:hAnsi="Symbol" w:hint="default"/>
+        <w:sz w:val="20"/>
+      </w:rPr>
+    </w:lvl>
+    <w:lvl w:ilvl="1" w:tentative="1">
+      <w:start w:val="1"/>
+      <w:numFmt w:val="bullet"/>
+      <w:lvlText w:val="o"/>
+      <w:lvlJc w:val="left"/>
+      <w:pPr>
+        <w:tabs>
+          <w:tab w:val="num" w:pos="2160"/>
+        </w:tabs>
+        <w:ind w:left="2160" w:hanging="360"/>
+      </w:pPr>
+      <w:rPr>
+        <w:rFonts w:ascii="Courier New" w:hAnsi="Courier New" w:hint="default"/>
+        <w:sz w:val="20"/>
+      </w:rPr>
+    </w:lvl>
+    <w:lvl w:ilvl="2" w:tentative="1">
+      <w:start w:val="1"/>
+      <w:numFmt w:val="bullet"/>
+      <w:lvlText w:val=""/>
+      <w:lvlJc w:val="left"/>
+      <w:pPr>
+        <w:tabs>
+          <w:tab w:val="num" w:pos="2880"/>
+        </w:tabs>
+        <w:ind w:left="2880" w:hanging="360"/>
+      </w:pPr>
+      <w:rPr>
+        <w:rFonts w:ascii="Wingdings" w:hAnsi="Wingdings" w:hint="default"/>
+        <w:sz w:val="20"/>
+      </w:rPr>
+    </w:lvl>
+    <w:lvl w:ilvl="3" w:tentative="1">
+      <w:start w:val="1"/>
+      <w:numFmt w:val="bullet"/>
+      <w:lvlText w:val=""/>
+      <w:lvlJc w:val="left"/>
+      <w:pPr>
+        <w:tabs>
+          <w:tab w:val="num" w:pos="3600"/>
+        </w:tabs>
+        <w:ind w:left="3600" w:hanging="360"/>
+      </w:pPr>
+      <w:rPr>
+        <w:rFonts w:ascii="Wingdings" w:hAnsi="Wingdings" w:hint="default"/>
+        <w:sz w:val="20"/>
+      </w:rPr>
+    </w:lvl>
+    <w:lvl w:ilvl="4" w:tentative="1">
+      <w:start w:val="1"/>
+      <w:numFmt w:val="bullet"/>
+      <w:lvlText w:val=""/>
+      <w:lvlJc w:val="left"/>
+      <w:pPr>
+        <w:tabs>
+          <w:tab w:val="num" w:pos="4320"/>
+        </w:tabs>
+        <w:ind w:left="4320" w:hanging="360"/>
+      </w:pPr>
+      <w:rPr>
+        <w:rFonts w:ascii="Wingdings" w:hAnsi="Wingdings" w:hint="default"/>
+        <w:sz w:val="20"/>
+      </w:rPr>
+    </w:lvl>
+    <w:lvl w:ilvl="5" w:tentative="1">
+      <w:start w:val="1"/>
+      <w:numFmt w:val="bullet"/>
+      <w:lvlText w:val=""/>
+      <w:lvlJc w:val="left"/>
+      <w:pPr>
+        <w:tabs>
+          <w:tab w:val="num" w:pos="5040"/>
+        </w:tabs>
+        <w:ind w:left="5040" w:hanging="360"/>
+      </w:pPr>
+      <w:rPr>
+        <w:rFonts w:ascii="Wingdings" w:hAnsi="Wingdings" w:hint="default"/>
+        <w:sz w:val="20"/>
+      </w:rPr>
+    </w:lvl>
+    <w:lvl w:ilvl="6" w:tentative="1">
+      <w:start w:val="1"/>
+      <w:numFmt w:val="bullet"/>
+      <w:lvlText w:val=""/>
+      <w:lvlJc w:val="left"/>
+      <w:pPr>
+        <w:tabs>
+          <w:tab w:val="num" w:pos="5760"/>
+        </w:tabs>
+        <w:ind w:left="5760" w:hanging="360"/>
+      </w:pPr>
+      <w:rPr>
+        <w:rFonts w:ascii="Wingdings" w:hAnsi="Wingdings" w:hint="default"/>
+        <w:sz w:val="20"/>
+      </w:rPr>
+    </w:lvl>
+    <w:lvl w:ilvl="7" w:tentative="1">
+      <w:start w:val="1"/>
+      <w:numFmt w:val="bullet"/>
+      <w:lvlText w:val=""/>
+      <w:lvlJc w:val="left"/>
+      <w:pPr>
+        <w:tabs>
+          <w:tab w:val="num" w:pos="6480"/>
+        </w:tabs>
+        <w:ind w:left="6480" w:hanging="360"/>
+      </w:pPr>
+      <w:rPr>
+        <w:rFonts w:ascii="Wingdings" w:hAnsi="Wingdings" w:hint="default"/>
+        <w:sz w:val="20"/>
+      </w:rPr>
+    </w:lvl>
+    <w:lvl w:ilvl="8" w:tentative="1">
+      <w:start w:val="1"/>
+      <w:numFmt w:val="bullet"/>
+      <w:lvlText w:val=""/>
+      <w:lvlJc w:val="left"/>
+      <w:pPr>
+        <w:tabs>
+          <w:tab w:val="num" w:pos="7200"/>
+        </w:tabs>
+        <w:ind w:left="7200" w:hanging="360"/>
+      </w:pPr>
+      <w:rPr>
+        <w:rFonts w:ascii="Wingdings" w:hAnsi="Wingdings" w:hint="default"/>
+        <w:sz w:val="20"/>
+      </w:rPr>
+    </w:lvl>
+  </w:abstractNum>
+  <w:num w:numId="1" w16cid:durableId="1766227730">
+    <w:abstractNumId w:val="0"/>
+  </w:num>
+</w:numbering>
+</file>
+
 <file path=word/styles.xml><?xml version="1.0" encoding="utf-8"?>
-<w:styles xmlns:mc="http://schemas.openxmlformats.org/markup-compatibility/2006" xmlns:r="http://schemas.openxmlformats.org/officeDocument/2006/relationships" xmlns:w="http://schemas.openxmlformats.org/wordprocessingml/2006/main" xmlns:w14="http://schemas.microsoft.com/office/word/2010/wordml" xmlns:w15="http://schemas.microsoft.com/office/word/2012/wordml" xmlns:w16cex="http://schemas.microsoft.com/office/word/2018/wordml/cex" xmlns:w16cid="http://schemas.microsoft.com/office/word/2016/wordml/cid" xmlns:w16="http://schemas.microsoft.com/office/word/2018/wordml" xmlns:w16du="http://schemas.microsoft.com/office/word/2023/wordml/word16du" xmlns:w16sdtdh="http://schemas.microsoft.com/office/word/2020/wordml/sdtdatahash" xmlns:w16se="http://schemas.microsoft.com/office/word/2015/wordml/symex" mc:Ignorable="w14 w15 w16se w16cid w16 w16cex w16sdtdh w16du">
+<w:styles xmlns:mc="http://schemas.openxmlformats.org/markup-compatibility/2006" xmlns:r="http://schemas.openxmlformats.org/officeDocument/2006/relationships" xmlns:w="http://schemas.openxmlformats.org/wordprocessingml/2006/main" xmlns:w14="http://schemas.microsoft.com/office/word/2010/wordml" xmlns:w15="http://schemas.microsoft.com/office/word/2012/wordml" xmlns:w16cex="http://schemas.microsoft.com/office/word/2018/wordml/cex" xmlns:w16cid="http://schemas.microsoft.com/office/word/2016/wordml/cid" xmlns:w16="http://schemas.microsoft.com/office/word/2018/wordml" xmlns:w16du="http://schemas.microsoft.com/office/word/2023/wordml/word16du" xmlns:w16sdtdh="http://schemas.microsoft.com/office/word/2020/wordml/sdtdatahash" xmlns:w16sdtfl="http://schemas.microsoft.com/office/word/2024/wordml/sdtformatlock" xmlns:w16se="http://schemas.microsoft.com/office/word/2015/wordml/symex" mc:Ignorable="w14 w15 w16se w16cid w16 w16cex w16sdtdh w16sdtfl w16du">
   <w:docDefaults>
     <w:rPrDefault>
       <w:rPr>
@@ -772,7 +1701,6 @@
   <w:style w:type="character" w:default="1" w:styleId="DefaultParagraphFont">
     <w:name w:val="Default Paragraph Font"/>
     <w:uiPriority w:val="1"/>
-    <w:semiHidden/>
     <w:unhideWhenUsed/>
   </w:style>
   <w:style w:type="table" w:default="1" w:styleId="TableNormal">
@@ -1190,6 +2118,29 @@
     <w:pPr>
       <w:outlineLvl w:val="9"/>
     </w:pPr>
+  </w:style>
+  <w:style w:type="character" w:styleId="Hyperlink">
+    <w:name w:val="Hyperlink"/>
+    <w:basedOn w:val="DefaultParagraphFont"/>
+    <w:uiPriority w:val="99"/>
+    <w:unhideWhenUsed/>
+    <w:rsid w:val="00B51C83"/>
+    <w:rPr>
+      <w:color w:val="0563C1" w:themeColor="hyperlink"/>
+      <w:u w:val="single"/>
+    </w:rPr>
+  </w:style>
+  <w:style w:type="character" w:styleId="UnresolvedMention">
+    <w:name w:val="Unresolved Mention"/>
+    <w:basedOn w:val="DefaultParagraphFont"/>
+    <w:uiPriority w:val="99"/>
+    <w:semiHidden/>
+    <w:unhideWhenUsed/>
+    <w:rsid w:val="00B51C83"/>
+    <w:rPr>
+      <w:color w:val="605E5C"/>
+      <w:shd w:val="clear" w:color="auto" w:fill="E1DFDD"/>
+    </w:rPr>
   </w:style>
 </w:styles>
 </file>

</xml_diff>